<commit_message>
Practica 5: guia guiada v5 con la URL de esta carpeta en materiales, paso 3 y referencias
Co-Authored-By: Claude Fable 5.1 <noreply@anthropic.com>
</commit_message>
<xml_diff>
--- a/practica5-tacometro-optico/guia-practica5/Practica5-Guia-Guiada.docx
+++ b/practica5-tacometro-optico/guia-practica5/Practica5-Guia-Guiada.docx
@@ -730,6 +730,49 @@
       <w:pPr>
         <w:spacing w:before="0" w:after="40"/>
       </w:pPr>
+    </w:p>
+    <w:p>
+      <w:pPr>
+        <w:spacing w:before="120" w:after="80"/>
+      </w:pPr>
+      <w:r>
+        <w:rPr>
+          <w:b w:val="0"/>
+          <w:i w:val="0"/>
+          <w:sz w:val="21"/>
+        </w:rPr>
+        <w:t>Código, diagrama de conexiones, diagrama a bloques, disco de 4 PPR y esta guía (descarga la carpeta completa):</w:t>
+      </w:r>
+    </w:p>
+    <w:p>
+      <w:pPr>
+        <w:spacing w:before="0" w:after="80"/>
+        <w:jc w:val="center"/>
+      </w:pPr>
+      <w:r>
+        <w:rPr>
+          <w:b/>
+          <w:i w:val="0"/>
+          <w:color w:val="1F4E79"/>
+          <w:sz w:val="22"/>
+        </w:rPr>
+        <w:t>https://github.com/esmarr58/programas-optoelectronica/tree/main/practica5-tacometro-optico</w:t>
+      </w:r>
+    </w:p>
+    <w:p>
+      <w:pPr>
+        <w:spacing w:before="0" w:after="120"/>
+        <w:jc w:val="center"/>
+      </w:pPr>
+      <w:r>
+        <w:rPr>
+          <w:b w:val="0"/>
+          <w:i w:val="0"/>
+          <w:color w:val="1F2A3A"/>
+          <w:sz w:val="20"/>
+        </w:rPr>
+        <w:t>Abre practica5_tacometro_optico.ino (con tacometro.h en la misma carpeta) en Arduino IDE · placa «ESP32S3 Dev Module» · core Arduino-ESP32 v3.x · Monitor Serial a 115200 bps con «Nueva línea».</w:t>
+      </w:r>
     </w:p>
     <w:p>
       <w:pPr>
@@ -2839,7 +2882,7 @@
           <w:color w:val="1F2A3A"/>
           <w:sz w:val="22"/>
         </w:rPr>
-        <w:t>con 5 V motor desconectados, abre el .ino P5 en Firmware, elige ESP32S3 Dev Module, carga y abre Monitor Serial a 115200 bps con Nueva línea. Escribe ayuda, stop, ppr 4 y leer.</w:t>
+        <w:t>con 5 V motor desconectados, descarga la carpeta practica5-tacometro-optico del repositorio (URL en la página de materiales), abre practica5_tacometro_optico.ino, elige ESP32S3 Dev Module, carga y abre Monitor Serial a 115200 bps con Nueva línea. Escribe ayuda, stop, ppr 4 y leer.</w:t>
       </w:r>
     </w:p>
     <w:p>
@@ -11075,7 +11118,7 @@
           <w:color w:val="1F2A3A"/>
           <w:sz w:val="20"/>
         </w:rPr>
-        <w:t>TCRT5000 Vishay: www.vishay.com/docs/83760/tcrt5000.pdf. ESP32-S3: www.espressif.com/sites/default/files/documentation/esp32-s3_datasheet_en.pdf, tabla DC, p. 65 (V_IL/V_IH). Guía P4 y su Circuito 3. Programa de P5 y diagramas incluidos en la carpeta Firmware.</w:t>
+        <w:t>TCRT5000 Vishay: www.vishay.com/docs/83760/tcrt5000.pdf. ESP32-S3: www.espressif.com/sites/default/files/documentation/esp32-s3_datasheet_en.pdf, tabla DC, p. 65 (V_IL/V_IH). Guía P4 y su Circuito 3. Programa de P5, diagramas y disco: github.com/esmarr58/programas-optoelectronica/tree/main/practica5-tacometro-optico</w:t>
       </w:r>
     </w:p>
     <w:p>

</xml_diff>